<commit_message>
Communication protocol parity update UART
</commit_message>
<xml_diff>
--- a/Communication Protocols.docx
+++ b/Communication Protocols.docx
@@ -722,15 +722,7 @@
         <w:pStyle w:val="myhead3"/>
       </w:pPr>
       <w:r>
-        <w:t xml:space="preserve">Important ownership </w:t>
-      </w:r>
-      <w:proofErr w:type="gramStart"/>
-      <w:r>
-        <w:t>rule</w:t>
-      </w:r>
-      <w:proofErr w:type="gramEnd"/>
-      <w:r>
-        <w:t>:</w:t>
+        <w:t>Important ownership rule:</w:t>
       </w:r>
     </w:p>
     <w:p>
@@ -1375,15 +1367,7 @@
     </w:p>
     <w:p>
       <w:r>
-        <w:t xml:space="preserve">The reason is physical. If you write a new bit and read it on the same edge, you're reading the line at the exact moment it's changing — that's a setup time violation. You'd get garbage. </w:t>
-      </w:r>
-      <w:proofErr w:type="gramStart"/>
-      <w:r>
-        <w:t>So</w:t>
-      </w:r>
-      <w:proofErr w:type="gramEnd"/>
-      <w:r>
-        <w:t xml:space="preserve"> the protocol separates them:</w:t>
+        <w:t>The reason is physical. If you write a new bit and read it on the same edge, you're reading the line at the exact moment it's changing — that's a setup time violation. You'd get garbage. So the protocol separates them:</w:t>
       </w:r>
     </w:p>
     <w:p>
@@ -2651,13 +2635,8 @@
       </w:tr>
     </w:tbl>
     <w:p>
-      <w:proofErr w:type="gramStart"/>
       <w:r>
-        <w:t>So</w:t>
-      </w:r>
-      <w:proofErr w:type="gramEnd"/>
-      <w:r>
-        <w:t xml:space="preserve"> the complete CPHA=0 rule is:</w:t>
+        <w:t>So the complete CPHA=0 rule is:</w:t>
       </w:r>
     </w:p>
     <w:tbl>
@@ -3172,15 +3151,7 @@
         </w:numPr>
       </w:pPr>
       <w:r>
-        <w:t xml:space="preserve">...and </w:t>
-      </w:r>
-      <w:proofErr w:type="gramStart"/>
-      <w:r>
-        <w:t>so</w:t>
-      </w:r>
-      <w:proofErr w:type="gramEnd"/>
-      <w:r>
-        <w:t xml:space="preserve"> on</w:t>
+        <w:t>...and so on</w:t>
       </w:r>
     </w:p>
     <w:p>
@@ -3449,15 +3420,7 @@
         <w:pStyle w:val="font-claude-response-body"/>
       </w:pPr>
       <w:r>
-        <w:t>Never assert two CS lines simultaneously. Two slaves will both drive MISO — bus contention, data corruption</w:t>
-      </w:r>
-      <w:proofErr w:type="gramStart"/>
-      <w:r>
-        <w:t>, possible hardware</w:t>
-      </w:r>
-      <w:proofErr w:type="gramEnd"/>
-      <w:r>
-        <w:t xml:space="preserve"> damage.</w:t>
+        <w:t>Never assert two CS lines simultaneously. Two slaves will both drive MISO — bus contention, data corruption, possible hardware damage.</w:t>
       </w:r>
     </w:p>
     <w:p>
@@ -3627,23 +3590,13 @@
                 <w:szCs w:val="20"/>
               </w:rPr>
             </w:pPr>
-            <w:proofErr w:type="gramStart"/>
             <w:r>
               <w:rPr>
                 <w:rFonts w:ascii="Consolas" w:hAnsi="Consolas"/>
                 <w:sz w:val="20"/>
                 <w:szCs w:val="20"/>
               </w:rPr>
-              <w:t>Full-duplex</w:t>
-            </w:r>
-            <w:proofErr w:type="gramEnd"/>
-            <w:r>
-              <w:rPr>
-                <w:rFonts w:ascii="Consolas" w:hAnsi="Consolas"/>
-                <w:sz w:val="20"/>
-                <w:szCs w:val="20"/>
-              </w:rPr>
-              <w:t xml:space="preserve"> = master and slave swap shift registers simultaneously</w:t>
+              <w:t>Full-duplex = master and slave swap shift registers simultaneously</w:t>
             </w:r>
           </w:p>
           <w:p>
@@ -3741,15 +3694,7 @@
       </w:pPr>
       <w:r>
         <w:lastRenderedPageBreak/>
-        <w:t xml:space="preserve">12. One-Line Mental Models to Carry </w:t>
-      </w:r>
-      <w:proofErr w:type="gramStart"/>
-      <w:r>
-        <w:t>Into</w:t>
-      </w:r>
-      <w:proofErr w:type="gramEnd"/>
-      <w:r>
-        <w:t xml:space="preserve"> Interviews</w:t>
+        <w:t>12. One-Line Mental Models to Carry Into Interviews</w:t>
       </w:r>
     </w:p>
     <w:p>
@@ -4517,25 +4462,7 @@
                 <w:sz w:val="20"/>
                 <w:szCs w:val="20"/>
               </w:rPr>
-              <w:t xml:space="preserve">2. Rising edge  → master reads MISO, slave reads MOSI (both </w:t>
-            </w:r>
-            <w:proofErr w:type="gramStart"/>
-            <w:r>
-              <w:rPr>
-                <w:rFonts w:ascii="Consolas" w:hAnsi="Consolas"/>
-                <w:sz w:val="20"/>
-                <w:szCs w:val="20"/>
-              </w:rPr>
-              <w:t>sample</w:t>
-            </w:r>
-            <w:proofErr w:type="gramEnd"/>
-            <w:r>
-              <w:rPr>
-                <w:rFonts w:ascii="Consolas" w:hAnsi="Consolas"/>
-                <w:sz w:val="20"/>
-                <w:szCs w:val="20"/>
-              </w:rPr>
-              <w:t xml:space="preserve"> simultaneously)</w:t>
+              <w:t>2. Rising edge  → master reads MISO, slave reads MOSI (both sample simultaneously)</w:t>
             </w:r>
           </w:p>
           <w:p>
@@ -5539,15 +5466,7 @@
         </w:numPr>
       </w:pPr>
       <w:r>
-        <w:t xml:space="preserve">Mode 0 and Mode 3 </w:t>
-      </w:r>
-      <w:proofErr w:type="gramStart"/>
-      <w:r>
-        <w:t>most</w:t>
-      </w:r>
-      <w:proofErr w:type="gramEnd"/>
-      <w:r>
-        <w:t xml:space="preserve"> common in real devices</w:t>
+        <w:t>Mode 0 and Mode 3 most common in real devices</w:t>
       </w:r>
     </w:p>
     <w:p/>
@@ -6268,15 +6187,7 @@
         <w:ind w:firstLine="720"/>
       </w:pPr>
       <w:r>
-        <w:t xml:space="preserve">Master and slave each have a shift register connected in a ring via MOSI and MISO. Every clock edge shifts one </w:t>
-      </w:r>
-      <w:proofErr w:type="gramStart"/>
-      <w:r>
-        <w:t>bit</w:t>
-      </w:r>
-      <w:proofErr w:type="gramEnd"/>
-      <w:r>
-        <w:t xml:space="preserve"> each direction simultaneously — after 8 clocks they've completely swapped registers.</w:t>
+        <w:t>Master and slave each have a shift register connected in a ring via MOSI and MISO. Every clock edge shifts one bit each direction simultaneously — after 8 clocks they've completely swapped registers.</w:t>
       </w:r>
     </w:p>
     <w:p>
@@ -6330,25 +6241,7 @@
           <w:b/>
           <w:bCs/>
         </w:rPr>
-        <w:t xml:space="preserve">Q3: Why </w:t>
-      </w:r>
-      <w:proofErr w:type="gramStart"/>
-      <w:r>
-        <w:rPr>
-          <w:rStyle w:val="Strong"/>
-          <w:b/>
-          <w:bCs/>
-        </w:rPr>
-        <w:t>wait</w:t>
-      </w:r>
-      <w:proofErr w:type="gramEnd"/>
-      <w:r>
-        <w:rPr>
-          <w:rStyle w:val="Strong"/>
-          <w:b/>
-          <w:bCs/>
-        </w:rPr>
-        <w:t xml:space="preserve"> BSY before de-asserting CS?</w:t>
+        <w:t>Q3: Why wait BSY before de-asserting CS?</w:t>
       </w:r>
     </w:p>
     <w:p>
@@ -6356,15 +6249,7 @@
         <w:ind w:firstLine="720"/>
       </w:pPr>
       <w:r>
-        <w:t xml:space="preserve">TXE goes high when DR is </w:t>
-      </w:r>
-      <w:proofErr w:type="gramStart"/>
-      <w:r>
-        <w:t>empty</w:t>
-      </w:r>
-      <w:proofErr w:type="gramEnd"/>
-      <w:r>
-        <w:t xml:space="preserve"> but the byte is still shifting out in the shift register. BSY stays HIGH until the last bit is shifted. De-asserting CS while BSY=1 cuts the transfer mid-byte.</w:t>
+        <w:t>TXE goes high when DR is empty but the byte is still shifting out in the shift register. BSY stays HIGH until the last bit is shifted. De-asserting CS while BSY=1 cuts the transfer mid-byte.</w:t>
       </w:r>
     </w:p>
     <w:p>
@@ -6390,23 +6275,7 @@
         <w:ind w:firstLine="720"/>
       </w:pPr>
       <w:r>
-        <w:t xml:space="preserve">Both </w:t>
-      </w:r>
-      <w:proofErr w:type="gramStart"/>
-      <w:r>
-        <w:t>sample</w:t>
-      </w:r>
-      <w:proofErr w:type="gramEnd"/>
-      <w:r>
-        <w:t xml:space="preserve"> on rising edge. Only difference is </w:t>
-      </w:r>
-      <w:proofErr w:type="gramStart"/>
-      <w:r>
-        <w:t>clock</w:t>
-      </w:r>
-      <w:proofErr w:type="gramEnd"/>
-      <w:r>
-        <w:t xml:space="preserve"> idle level. Most devices work on either. Matters at CS assertion moment — some devices are sensitive to the clock level when CS asserts.</w:t>
+        <w:t>Both sample on rising edge. Only difference is clock idle level. Most devices work on either. Matters at CS assertion moment — some devices are sensitive to the clock level when CS asserts.</w:t>
       </w:r>
     </w:p>
     <w:p>
@@ -6772,15 +6641,7 @@
     <w:p/>
     <w:p>
       <w:r>
-        <w:t xml:space="preserve">Both lines are open-drain with pull-up resistors — nobody actively drives </w:t>
-      </w:r>
-      <w:proofErr w:type="gramStart"/>
-      <w:r>
-        <w:t>HIGH,</w:t>
-      </w:r>
-      <w:proofErr w:type="gramEnd"/>
-      <w:r>
-        <w:t xml:space="preserve"> resistor pulls HIGH passively. Any device can pull LOW anytime without short circuit. Dominant state = LOW.</w:t>
+        <w:t>Both lines are open-drain with pull-up resistors — nobody actively drives HIGH, resistor pulls HIGH passively. Any device can pull LOW anytime without short circuit. Dominant state = LOW.</w:t>
       </w:r>
     </w:p>
     <w:tbl>
@@ -6876,43 +6737,7 @@
                 <w:sz w:val="20"/>
                 <w:szCs w:val="20"/>
               </w:rPr>
-              <w:t>[Rp] ← 4.7</w:t>
-            </w:r>
-            <w:proofErr w:type="gramStart"/>
-            <w:r>
-              <w:rPr>
-                <w:rFonts w:ascii="Consolas" w:hAnsi="Consolas"/>
-                <w:sz w:val="20"/>
-                <w:szCs w:val="20"/>
-              </w:rPr>
-              <w:t>kΩ @</w:t>
-            </w:r>
-            <w:proofErr w:type="gramEnd"/>
-            <w:r>
-              <w:rPr>
-                <w:rFonts w:ascii="Consolas" w:hAnsi="Consolas"/>
-                <w:sz w:val="20"/>
-                <w:szCs w:val="20"/>
-              </w:rPr>
-              <w:t xml:space="preserve"> 100kHz / 2.2</w:t>
-            </w:r>
-            <w:proofErr w:type="gramStart"/>
-            <w:r>
-              <w:rPr>
-                <w:rFonts w:ascii="Consolas" w:hAnsi="Consolas"/>
-                <w:sz w:val="20"/>
-                <w:szCs w:val="20"/>
-              </w:rPr>
-              <w:t>kΩ @</w:t>
-            </w:r>
-            <w:proofErr w:type="gramEnd"/>
-            <w:r>
-              <w:rPr>
-                <w:rFonts w:ascii="Consolas" w:hAnsi="Consolas"/>
-                <w:sz w:val="20"/>
-                <w:szCs w:val="20"/>
-              </w:rPr>
-              <w:t xml:space="preserve"> 400kHz</w:t>
+              <w:t>[Rp] ← 4.7kΩ @ 100kHz / 2.2kΩ @ 400kHz</w:t>
             </w:r>
           </w:p>
           <w:p>
@@ -7776,33 +7601,15 @@
                 <w:sz w:val="20"/>
                 <w:szCs w:val="20"/>
               </w:rPr>
-              <w:t xml:space="preserve">             READ             </w:t>
+              <w:t xml:space="preserve">             READ             READ</w:t>
             </w:r>
-            <w:proofErr w:type="spellStart"/>
-            <w:r>
-              <w:rPr>
-                <w:rFonts w:ascii="Consolas" w:hAnsi="Consolas"/>
-                <w:sz w:val="20"/>
-                <w:szCs w:val="20"/>
-              </w:rPr>
-              <w:t>READ</w:t>
-            </w:r>
-            <w:proofErr w:type="spellEnd"/>
           </w:p>
         </w:tc>
       </w:tr>
     </w:tbl>
     <w:p>
       <w:r>
-        <w:t xml:space="preserve">Identical concept to SPI — change on one edge, read on </w:t>
-      </w:r>
-      <w:proofErr w:type="gramStart"/>
-      <w:r>
-        <w:t>other</w:t>
-      </w:r>
-      <w:proofErr w:type="gramEnd"/>
-      <w:r>
-        <w:t>. In I2C: change when SCL LOW, read when SCL HIGH.</w:t>
+        <w:t>Identical concept to SPI — change on one edge, read on other. In I2C: change when SCL LOW, read when SCL HIGH.</w:t>
       </w:r>
     </w:p>
     <w:p>
@@ -9613,23 +9420,7 @@
         <w:ind w:firstLine="720"/>
       </w:pPr>
       <w:r>
-        <w:t xml:space="preserve">ACK means "got it, send more." NACK on last byte tells </w:t>
-      </w:r>
-      <w:proofErr w:type="gramStart"/>
-      <w:r>
-        <w:t>slave</w:t>
-      </w:r>
-      <w:proofErr w:type="gramEnd"/>
-      <w:r>
-        <w:t xml:space="preserve"> "I'm done, stop sending." Without NACK, slave keeps sending indefinitely. It's the only way master </w:t>
-      </w:r>
-      <w:proofErr w:type="gramStart"/>
-      <w:r>
-        <w:t>signals</w:t>
-      </w:r>
-      <w:proofErr w:type="gramEnd"/>
-      <w:r>
-        <w:t xml:space="preserve"> end of read.</w:t>
+        <w:t>ACK means "got it, send more." NACK on last byte tells slave "I'm done, stop sending." Without NACK, slave keeps sending indefinitely. It's the only way master signals end of read.</w:t>
       </w:r>
     </w:p>
     <w:p>
@@ -9748,15 +9539,7 @@
         <w:t>beforehand,</w:t>
       </w:r>
       <w:r>
-        <w:t xml:space="preserve"> and each runs its own internal clock at that speed. Every </w:t>
-      </w:r>
-      <w:proofErr w:type="spellStart"/>
-      <w:r>
-        <w:t>byte</w:t>
-      </w:r>
-      <w:proofErr w:type="spellEnd"/>
-      <w:r>
-        <w:t xml:space="preserve"> is wrapped in a frame with START and STOP bits — that framing is what makes asynchronous communication possible.</w:t>
+        <w:t xml:space="preserve"> and each runs its own internal clock at that speed. Every byte is wrapped in a frame with START and STOP bits — that framing is what makes asynchronous communication possible.</w:t>
       </w:r>
     </w:p>
     <w:p>
@@ -10120,15 +9903,7 @@
         <w:pStyle w:val="myheading30"/>
       </w:pPr>
       <w:r>
-        <w:t xml:space="preserve">Wiring </w:t>
-      </w:r>
-      <w:proofErr w:type="gramStart"/>
-      <w:r>
-        <w:t>rule —</w:t>
-      </w:r>
-      <w:proofErr w:type="gramEnd"/>
-      <w:r>
-        <w:t xml:space="preserve"> always cross-connect:</w:t>
+        <w:t>Wiring rule — always cross-connect:</w:t>
       </w:r>
     </w:p>
     <w:tbl>
@@ -10958,61 +10733,7 @@
           <w:bCs w:val="0"/>
           <w:color w:val="auto"/>
         </w:rPr>
-        <w:t>Written as: [</w:t>
-      </w:r>
-      <w:proofErr w:type="spellStart"/>
-      <w:r>
-        <w:rPr>
-          <w:b w:val="0"/>
-          <w:bCs w:val="0"/>
-          <w:color w:val="auto"/>
-        </w:rPr>
-        <w:t>BaudRate</w:t>
-      </w:r>
-      <w:proofErr w:type="spellEnd"/>
-      <w:r>
-        <w:rPr>
-          <w:b w:val="0"/>
-          <w:bCs w:val="0"/>
-          <w:color w:val="auto"/>
-        </w:rPr>
-        <w:t>] [</w:t>
-      </w:r>
-      <w:proofErr w:type="spellStart"/>
-      <w:r>
-        <w:rPr>
-          <w:b w:val="0"/>
-          <w:bCs w:val="0"/>
-          <w:color w:val="auto"/>
-        </w:rPr>
-        <w:t>DataBits</w:t>
-      </w:r>
-      <w:proofErr w:type="spellEnd"/>
-      <w:r>
-        <w:rPr>
-          <w:b w:val="0"/>
-          <w:bCs w:val="0"/>
-          <w:color w:val="auto"/>
-        </w:rPr>
-        <w:t>][Parity][</w:t>
-      </w:r>
-      <w:proofErr w:type="spellStart"/>
-      <w:r>
-        <w:rPr>
-          <w:b w:val="0"/>
-          <w:bCs w:val="0"/>
-          <w:color w:val="auto"/>
-        </w:rPr>
-        <w:t>StopBits</w:t>
-      </w:r>
-      <w:proofErr w:type="spellEnd"/>
-      <w:r>
-        <w:rPr>
-          <w:b w:val="0"/>
-          <w:bCs w:val="0"/>
-          <w:color w:val="auto"/>
-        </w:rPr>
-        <w:t>]</w:t>
+        <w:t>Written as: [BaudRate] [DataBits][Parity][StopBits]</w:t>
       </w:r>
     </w:p>
     <w:tbl>
@@ -11133,6 +10854,174 @@
       </w:tr>
     </w:tbl>
     <w:p/>
+    <w:p/>
+    <w:p>
+      <w:pPr>
+        <w:pStyle w:val="myheading30"/>
+      </w:pPr>
+      <w:r>
+        <w:t>Odd parity:</w:t>
+      </w:r>
+    </w:p>
+    <w:p>
+      <w:pPr>
+        <w:pStyle w:val="myhead3"/>
+      </w:pPr>
+      <w:r>
+        <w:t xml:space="preserve">Example 1: </w:t>
+      </w:r>
+    </w:p>
+    <w:p>
+      <w:r>
+        <w:t>If data has an odd number of 1s → parity = 0</w:t>
+      </w:r>
+    </w:p>
+    <w:p>
+      <w:r>
+        <w:t xml:space="preserve">Data has </w:t>
+      </w:r>
+      <w:r>
+        <w:t>5</w:t>
+      </w:r>
+      <w:r>
+        <w:t xml:space="preserve"> ones</w:t>
+      </w:r>
+    </w:p>
+    <w:p>
+      <w:pPr>
+        <w:rPr>
+          <w:b/>
+          <w:bCs/>
+        </w:rPr>
+      </w:pPr>
+      <w:r>
+        <w:rPr>
+          <w:b/>
+          <w:bCs/>
+        </w:rPr>
+        <w:t xml:space="preserve">10110011 </w:t>
+      </w:r>
+    </w:p>
+    <w:p>
+      <w:r>
+        <w:t>To keep the total odd:</w:t>
+      </w:r>
+    </w:p>
+    <w:p>
+      <w:r>
+        <w:br/>
+      </w:r>
+      <w:r>
+        <w:t>Parity bit = 0</w:t>
+      </w:r>
+    </w:p>
+    <w:p>
+      <w:r>
+        <w:t xml:space="preserve">Transmitted </w:t>
+      </w:r>
+      <w:r>
+        <w:sym w:font="Wingdings" w:char="F0E0"/>
+      </w:r>
+      <w:r>
+        <w:t xml:space="preserve"> </w:t>
+      </w:r>
+      <w:r>
+        <w:rPr>
+          <w:b/>
+          <w:bCs/>
+        </w:rPr>
+        <w:t>10110011 0</w:t>
+      </w:r>
+    </w:p>
+    <w:p/>
+    <w:p>
+      <w:pPr>
+        <w:pStyle w:val="myhead3"/>
+      </w:pPr>
+      <w:r>
+        <w:t>Example 2:</w:t>
+      </w:r>
+    </w:p>
+    <w:p>
+      <w:r>
+        <w:t>If data has an even number of 1s → parity = 1</w:t>
+      </w:r>
+    </w:p>
+    <w:p>
+      <w:r>
+        <w:t>Data has 4 ones</w:t>
+      </w:r>
+    </w:p>
+    <w:p>
+      <w:pPr>
+        <w:rPr>
+          <w:b/>
+          <w:bCs/>
+        </w:rPr>
+      </w:pPr>
+      <w:r>
+        <w:rPr>
+          <w:b/>
+          <w:bCs/>
+        </w:rPr>
+        <w:t>10110010</w:t>
+      </w:r>
+    </w:p>
+    <w:p>
+      <w:r>
+        <w:t>To make the total odd:</w:t>
+      </w:r>
+    </w:p>
+    <w:p>
+      <w:r>
+        <w:t>Parity bit = 1</w:t>
+      </w:r>
+    </w:p>
+    <w:p>
+      <w:pPr>
+        <w:rPr>
+          <w:b/>
+          <w:bCs/>
+        </w:rPr>
+      </w:pPr>
+      <w:r>
+        <w:t>Transmitted</w:t>
+      </w:r>
+      <w:r>
+        <w:t xml:space="preserve"> </w:t>
+      </w:r>
+      <w:r>
+        <w:sym w:font="Wingdings" w:char="F0E0"/>
+      </w:r>
+      <w:r>
+        <w:t xml:space="preserve"> </w:t>
+      </w:r>
+      <w:r>
+        <w:rPr>
+          <w:b/>
+          <w:bCs/>
+        </w:rPr>
+        <w:t>10110010 1</w:t>
+      </w:r>
+    </w:p>
+    <w:p>
+      <w:pPr>
+        <w:pStyle w:val="myheading30"/>
+      </w:pPr>
+      <w:r>
+        <w:t>Even parity:</w:t>
+      </w:r>
+    </w:p>
+    <w:p>
+      <w:r>
+        <w:t>If data has an even number of 1s → parity = 0</w:t>
+      </w:r>
+      <w:r>
+        <w:br/>
+        <w:t>If data has an odd number of 1s → parity = 1</w:t>
+      </w:r>
+    </w:p>
+    <w:p/>
     <w:tbl>
       <w:tblPr>
         <w:tblStyle w:val="PlainTable1"/>
@@ -11175,7 +11064,6 @@
                 <w:szCs w:val="24"/>
                 <w14:ligatures w14:val="none"/>
               </w:rPr>
-              <w:lastRenderedPageBreak/>
               <w:t>Parameter</w:t>
             </w:r>
           </w:p>
@@ -11714,6 +11602,7 @@
                 <w:sz w:val="20"/>
                 <w:szCs w:val="20"/>
               </w:rPr>
+              <w:lastRenderedPageBreak/>
               <w:t>Step 5 — Wait 1 full bit period → now at CENTER of D0 → sample</w:t>
             </w:r>
           </w:p>
@@ -11892,18 +11781,8 @@
                 <w:sz w:val="20"/>
                 <w:szCs w:val="20"/>
               </w:rPr>
-              <w:t xml:space="preserve">        Edge  0.5T    1T      </w:t>
+              <w:t xml:space="preserve">        Edge  0.5T    1T      1T</w:t>
             </w:r>
-            <w:proofErr w:type="spellStart"/>
-            <w:r>
-              <w:rPr>
-                <w:rFonts w:ascii="Consolas" w:hAnsi="Consolas"/>
-                <w:sz w:val="20"/>
-                <w:szCs w:val="20"/>
-              </w:rPr>
-              <w:t>1T</w:t>
-            </w:r>
-            <w:proofErr w:type="spellEnd"/>
           </w:p>
           <w:p>
             <w:pPr>
@@ -11938,36 +11817,8 @@
                 <w:sz w:val="20"/>
                 <w:szCs w:val="20"/>
               </w:rPr>
-              <w:t xml:space="preserve">              center  </w:t>
+              <w:t xml:space="preserve">              center  center center</w:t>
             </w:r>
-            <w:proofErr w:type="spellStart"/>
-            <w:r>
-              <w:rPr>
-                <w:rFonts w:ascii="Consolas" w:hAnsi="Consolas"/>
-                <w:sz w:val="20"/>
-                <w:szCs w:val="20"/>
-              </w:rPr>
-              <w:t>center</w:t>
-            </w:r>
-            <w:proofErr w:type="spellEnd"/>
-            <w:r>
-              <w:rPr>
-                <w:rFonts w:ascii="Consolas" w:hAnsi="Consolas"/>
-                <w:sz w:val="20"/>
-                <w:szCs w:val="20"/>
-              </w:rPr>
-              <w:t xml:space="preserve"> </w:t>
-            </w:r>
-            <w:proofErr w:type="spellStart"/>
-            <w:r>
-              <w:rPr>
-                <w:rFonts w:ascii="Consolas" w:hAnsi="Consolas"/>
-                <w:sz w:val="20"/>
-                <w:szCs w:val="20"/>
-              </w:rPr>
-              <w:t>center</w:t>
-            </w:r>
-            <w:proofErr w:type="spellEnd"/>
           </w:p>
         </w:tc>
       </w:tr>
@@ -12422,22 +12273,8 @@
           <w:numId w:val="395"/>
         </w:numPr>
       </w:pPr>
-      <w:proofErr w:type="gramStart"/>
       <w:r>
-        <w:lastRenderedPageBreak/>
-        <w:t>Compare</w:t>
-      </w:r>
-      <w:proofErr w:type="gramEnd"/>
-      <w:r>
-        <w:t xml:space="preserve"> with I2C — half-duplex, SDA shared, only one side talks at a time. UART dedicated lines each direction = true simultaneous </w:t>
-      </w:r>
-      <w:proofErr w:type="gramStart"/>
-      <w:r>
-        <w:t>full-duplex</w:t>
-      </w:r>
-      <w:proofErr w:type="gramEnd"/>
-      <w:r>
-        <w:t>.</w:t>
+        <w:t>Compare with I2C — half-duplex, SDA shared, only one side talks at a time. UART dedicated lines each direction = true simultaneous full-duplex.</w:t>
       </w:r>
     </w:p>
     <w:p>
@@ -13143,6 +12980,7 @@
         <w:pStyle w:val="myheading30"/>
       </w:pPr>
       <w:r>
+        <w:lastRenderedPageBreak/>
         <w:t>Flow Control</w:t>
       </w:r>
     </w:p>
@@ -13429,21 +13267,8 @@
       </w:tr>
     </w:tbl>
     <w:p>
-      <w:proofErr w:type="gramStart"/>
       <w:r>
-        <w:t>Transmitter</w:t>
-      </w:r>
-      <w:proofErr w:type="gramEnd"/>
-      <w:r>
-        <w:t xml:space="preserve"> only sends when CTS </w:t>
-      </w:r>
-      <w:proofErr w:type="gramStart"/>
-      <w:r>
-        <w:t>asserted</w:t>
-      </w:r>
-      <w:proofErr w:type="gramEnd"/>
-      <w:r>
-        <w:t>. Receiver de-asserts CTS when buffer full → transmitter pauses. Most reliable method.</w:t>
+        <w:t>Transmitter only sends when CTS asserted. Receiver de-asserts CTS when buffer full → transmitter pauses. Most reliable method.</w:t>
       </w:r>
     </w:p>
     <w:p>
@@ -13976,7 +13801,6 @@
         <w:pStyle w:val="myheading30"/>
       </w:pPr>
       <w:r>
-        <w:lastRenderedPageBreak/>
         <w:t>Debug Symptom → Root Cause</w:t>
       </w:r>
     </w:p>
@@ -14450,15 +14274,7 @@
         <w:ind w:firstLine="720"/>
       </w:pPr>
       <w:r>
-        <w:t xml:space="preserve">Re-syncs on every START bit's falling edge. From that edge receiver waits </w:t>
-      </w:r>
-      <w:proofErr w:type="gramStart"/>
-      <w:r>
-        <w:t>0.5 bit</w:t>
-      </w:r>
-      <w:proofErr w:type="gramEnd"/>
-      <w:r>
-        <w:t xml:space="preserve"> periods to reach center of START, then samples every full bit period. Drift only accumulates within one 10-bit frame — fresh sync on every new frame.</w:t>
+        <w:t>Re-syncs on every START bit's falling edge. From that edge receiver waits 0.5 bit periods to reach center of START, then samples every full bit period. Drift only accumulates within one 10-bit frame — fresh sync on every new frame.</w:t>
       </w:r>
     </w:p>
     <w:p>
@@ -14498,15 +14314,7 @@
         <w:ind w:firstLine="720"/>
       </w:pPr>
       <w:r>
-        <w:t xml:space="preserve">Ensures START is always a clean falling edge from a known state. </w:t>
-      </w:r>
-      <w:proofErr w:type="gramStart"/>
-      <w:r>
-        <w:t>Also</w:t>
-      </w:r>
-      <w:proofErr w:type="gramEnd"/>
-      <w:r>
-        <w:t xml:space="preserve"> a disconnected/broken line floats or pulls LOW — immediately distinguishable from valid idle HIGH. It's a passive line integrity check.</w:t>
+        <w:t>Ensures START is always a clean falling edge from a known state. Also a disconnected/broken line floats or pulls LOW — immediately distinguishable from valid idle HIGH. It's a passive line integrity check.</w:t>
       </w:r>
     </w:p>
     <w:p>
@@ -14554,15 +14362,7 @@
         <w:ind w:firstLine="720"/>
       </w:pPr>
       <w:r>
-        <w:t>Standard UART cannot — strictly point-to-point. RS-485 uses the same UART framing on a differential bus supporting up to 32 nodes. Some MCUs also have LIN mode which adds multi-</w:t>
-      </w:r>
-      <w:proofErr w:type="gramStart"/>
-      <w:r>
-        <w:t>drop</w:t>
-      </w:r>
-      <w:proofErr w:type="gramEnd"/>
-      <w:r>
-        <w:t xml:space="preserve"> on top of UART framing.</w:t>
+        <w:t>Standard UART cannot — strictly point-to-point. RS-485 uses the same UART framing on a differential bus supporting up to 32 nodes. Some MCUs also have LIN mode which adds multi-drop on top of UART framing.</w:t>
       </w:r>
     </w:p>
     <w:p>
@@ -15020,6 +14820,7 @@
                 <w:kern w:val="0"/>
                 <w14:ligatures w14:val="none"/>
               </w:rPr>
+              <w:lastRenderedPageBreak/>
               <w:t>Synchronous / Async</w:t>
             </w:r>
           </w:p>
@@ -15140,7 +14941,6 @@
                 <w14:ligatures w14:val="none"/>
               </w:rPr>
             </w:pPr>
-            <w:proofErr w:type="gramStart"/>
             <w:r>
               <w:rPr>
                 <w:rFonts w:ascii="Consolas" w:eastAsiaTheme="minorEastAsia" w:hAnsi="Consolas" w:cs="Consolas"/>
@@ -15150,7 +14950,6 @@
               </w:rPr>
               <w:t>Full-duplex</w:t>
             </w:r>
-            <w:proofErr w:type="gramEnd"/>
           </w:p>
         </w:tc>
         <w:tc>
@@ -15192,7 +14991,6 @@
                 <w14:ligatures w14:val="none"/>
               </w:rPr>
             </w:pPr>
-            <w:proofErr w:type="gramStart"/>
             <w:r>
               <w:rPr>
                 <w:rFonts w:ascii="Consolas" w:eastAsiaTheme="minorEastAsia" w:hAnsi="Consolas" w:cs="Consolas"/>
@@ -15202,7 +15000,6 @@
               </w:rPr>
               <w:t>Full-duplex</w:t>
             </w:r>
-            <w:proofErr w:type="gramEnd"/>
           </w:p>
         </w:tc>
       </w:tr>
@@ -16272,7 +16069,6 @@
                 <w14:ligatures w14:val="none"/>
               </w:rPr>
             </w:pPr>
-            <w:proofErr w:type="gramStart"/>
             <w:r>
               <w:rPr>
                 <w:rFonts w:ascii="Consolas" w:eastAsiaTheme="minorEastAsia" w:hAnsi="Consolas" w:cs="Consolas"/>
@@ -16280,17 +16076,7 @@
                 <w:kern w:val="0"/>
                 <w14:ligatures w14:val="none"/>
               </w:rPr>
-              <w:t>Not</w:t>
-            </w:r>
-            <w:proofErr w:type="gramEnd"/>
-            <w:r>
-              <w:rPr>
-                <w:rFonts w:ascii="Consolas" w:eastAsiaTheme="minorEastAsia" w:hAnsi="Consolas" w:cs="Consolas"/>
-                <w:bCs/>
-                <w:kern w:val="0"/>
-                <w14:ligatures w14:val="none"/>
-              </w:rPr>
-              <w:t xml:space="preserve"> needed</w:t>
+              <w:t>Not needed</w:t>
             </w:r>
           </w:p>
         </w:tc>
@@ -16335,7 +16121,6 @@
                 <w14:ligatures w14:val="none"/>
               </w:rPr>
             </w:pPr>
-            <w:proofErr w:type="gramStart"/>
             <w:r>
               <w:rPr>
                 <w:rFonts w:ascii="Consolas" w:eastAsiaTheme="minorEastAsia" w:hAnsi="Consolas" w:cs="Consolas"/>
@@ -16343,17 +16128,7 @@
                 <w:kern w:val="0"/>
                 <w14:ligatures w14:val="none"/>
               </w:rPr>
-              <w:t>Not</w:t>
-            </w:r>
-            <w:proofErr w:type="gramEnd"/>
-            <w:r>
-              <w:rPr>
-                <w:rFonts w:ascii="Consolas" w:eastAsiaTheme="minorEastAsia" w:hAnsi="Consolas" w:cs="Consolas"/>
-                <w:bCs/>
-                <w:kern w:val="0"/>
-                <w14:ligatures w14:val="none"/>
-              </w:rPr>
-              <w:t xml:space="preserve"> needed</w:t>
+              <w:t>Not needed</w:t>
             </w:r>
           </w:p>
         </w:tc>
@@ -16601,7 +16376,6 @@
                 <w14:ligatures w14:val="none"/>
               </w:rPr>
             </w:pPr>
-            <w:proofErr w:type="spellStart"/>
             <w:r>
               <w:rPr>
                 <w:rFonts w:ascii="Consolas" w:eastAsiaTheme="minorEastAsia" w:hAnsi="Consolas" w:cs="Consolas"/>
@@ -16609,17 +16383,7 @@
                 <w:kern w:val="0"/>
                 <w14:ligatures w14:val="none"/>
               </w:rPr>
-              <w:t>Nonbuilt</w:t>
-            </w:r>
-            <w:proofErr w:type="spellEnd"/>
-            <w:r>
-              <w:rPr>
-                <w:rFonts w:ascii="Consolas" w:eastAsiaTheme="minorEastAsia" w:hAnsi="Consolas" w:cs="Consolas"/>
-                <w:bCs/>
-                <w:kern w:val="0"/>
-                <w14:ligatures w14:val="none"/>
-              </w:rPr>
-              <w:t>-in</w:t>
+              <w:t>Nonbuilt-in</w:t>
             </w:r>
           </w:p>
         </w:tc>
@@ -17209,7 +16973,6 @@
                 <w:kern w:val="0"/>
                 <w14:ligatures w14:val="none"/>
               </w:rPr>
-              <w:lastRenderedPageBreak/>
               <w:t>Data Direction Control</w:t>
             </w:r>
           </w:p>
@@ -17723,6 +17486,7 @@
                 <w:kern w:val="0"/>
                 <w14:ligatures w14:val="none"/>
               </w:rPr>
+              <w:lastRenderedPageBreak/>
               <w:t>Clock Stretching</w:t>
             </w:r>
           </w:p>
@@ -18465,19 +18229,8 @@
                 <w:kern w:val="0"/>
                 <w14:ligatures w14:val="none"/>
               </w:rPr>
-              <w:t xml:space="preserve">Need speed, large data, </w:t>
+              <w:t>Need speed, large data, full-duplex</w:t>
             </w:r>
-            <w:proofErr w:type="gramStart"/>
-            <w:r>
-              <w:rPr>
-                <w:rFonts w:ascii="Consolas" w:eastAsiaTheme="minorEastAsia" w:hAnsi="Consolas" w:cs="Consolas"/>
-                <w:bCs/>
-                <w:kern w:val="0"/>
-                <w14:ligatures w14:val="none"/>
-              </w:rPr>
-              <w:t>full-duplex</w:t>
-            </w:r>
-            <w:proofErr w:type="gramEnd"/>
           </w:p>
         </w:tc>
         <w:tc>
@@ -18605,19 +18358,8 @@
                 <w:kern w:val="0"/>
                 <w14:ligatures w14:val="none"/>
               </w:rPr>
-              <w:t xml:space="preserve">Need high speed or </w:t>
+              <w:t>Need high speed or full-duplex</w:t>
             </w:r>
-            <w:proofErr w:type="gramStart"/>
-            <w:r>
-              <w:rPr>
-                <w:rFonts w:ascii="Consolas" w:eastAsiaTheme="minorEastAsia" w:hAnsi="Consolas" w:cs="Consolas"/>
-                <w:bCs/>
-                <w:kern w:val="0"/>
-                <w14:ligatures w14:val="none"/>
-              </w:rPr>
-              <w:t>full-duplex</w:t>
-            </w:r>
-            <w:proofErr w:type="gramEnd"/>
           </w:p>
         </w:tc>
         <w:tc>
@@ -56108,7 +55850,6 @@
   <w:style w:type="character" w:default="1" w:styleId="DefaultParagraphFont">
     <w:name w:val="Default Paragraph Font"/>
     <w:uiPriority w:val="1"/>
-    <w:semiHidden/>
     <w:unhideWhenUsed/>
   </w:style>
   <w:style w:type="table" w:default="1" w:styleId="TableNormal">

</xml_diff>